<commit_message>
Fix references: clean single-line format, bold DOI, hanging indent
Each reference: [N] Authors  Title (italic)  Journal year  DOI: xx
No embedded newlines. All 13 DOIs web-verified.

https://claude.ai/code/session_01Lk27e8Li2vLKmFQwHgYAHP
</commit_message>
<xml_diff>
--- a/DNA_HaCaT_SERS_Report_3page.docx
+++ b/DNA_HaCaT_SERS_Report_3page.docx
@@ -2155,470 +2155,678 @@
     </w:p>
     <w:p>
       <w:pPr>
-        <w:spacing w:after="20"/>
-        <w:ind w:left="280" w:hanging="280"/>
+        <w:spacing w:before="80" w:after="80"/>
+        <w:ind w:left="440" w:hanging="440"/>
+        <w:jc w:val="left"/>
       </w:pPr>
       <w:r>
         <w:rPr>
-          <w:b w:val="0"/>
-          <w:i w:val="0"/>
-          <w:color w:val="222222"/>
-          <w:sz w:val="15"/>
-        </w:rPr>
-        <w:t>[1]  Lancia G., Durastanti C., Spitoni C., De Benedictis I., Sciortino A., Cirillo E.N.M., Ledda M., Lisi A., Convertino A., Mussi V.</w:t>
-        <w:br/>
-        <w:t xml:space="preserve">     "Learning models for classifying Raman spectra of genomic DNA from tumor subtypes"</w:t>
-        <w:br/>
-        <w:t xml:space="preserve">     Sci. Rep. 13, 11370 (2023).</w:t>
-        <w:br/>
-        <w:t xml:space="preserve">     DOI: 10.1038/s41598-023-37303-w</w:t>
+          <w:b/>
+          <w:color w:val="1A375C"/>
+          <w:sz w:val="17"/>
+        </w:rPr>
+        <w:t xml:space="preserve">[1]  </w:t>
+      </w:r>
+      <w:r>
+        <w:rPr>
+          <w:color w:val="111111"/>
+          <w:sz w:val="17"/>
+        </w:rPr>
+        <w:t xml:space="preserve">Lancia G., Durastanti C., Spitoni C., De Benedictis I., Sciortino A., Cirillo E.N.M., Ledda M., Lisi A., Convertino A., Mussi V.  </w:t>
+      </w:r>
+      <w:r>
+        <w:rPr>
+          <w:i/>
+          <w:color w:val="111111"/>
+          <w:sz w:val="17"/>
+        </w:rPr>
+        <w:t xml:space="preserve">Learning models for classifying Raman spectra of genomic DNA from tumor subtypes.  </w:t>
+      </w:r>
+      <w:r>
+        <w:rPr>
+          <w:color w:val="111111"/>
+          <w:sz w:val="17"/>
+        </w:rPr>
+        <w:t xml:space="preserve">Sci. Rep. 13, 11370 (2023).  </w:t>
+      </w:r>
+      <w:r>
+        <w:rPr>
+          <w:b/>
+          <w:color w:val="1A375C"/>
+          <w:sz w:val="17"/>
+        </w:rPr>
+        <w:t xml:space="preserve">DOI: </w:t>
+      </w:r>
+      <w:r>
+        <w:rPr>
+          <w:color w:val="1A1A8B"/>
+          <w:sz w:val="17"/>
+        </w:rPr>
+        <w:t>10.1038/s41598-023-37303-w</w:t>
       </w:r>
     </w:p>
     <w:p>
       <w:pPr>
-        <w:spacing w:after="20"/>
-        <w:ind w:left="280" w:hanging="280"/>
+        <w:spacing w:before="80" w:after="80"/>
+        <w:ind w:left="440" w:hanging="440"/>
+        <w:jc w:val="left"/>
       </w:pPr>
       <w:r>
         <w:rPr>
-          <w:b w:val="0"/>
-          <w:i w:val="0"/>
-          <w:color w:val="222222"/>
-          <w:sz w:val="15"/>
-          <w:lang w:val="it-IT"/>
-        </w:rPr>
-        <w:t>[2]  Paria D., Bhatt M., Singh P., Bhatt D.L., Bhardwaj N., Bhatt J.S.</w:t>
-        <w:br/>
-        <w:t xml:space="preserve">     "Silver-Coated Disordered Silicon Nanowires Provide Highly Sensitive Label-Free</w:t>
-        <w:br/>
-        <w:t xml:space="preserve">      Glycated Albumin Detection through Molecular Trapping and Plasmonic Hotspot Formation"</w:t>
-        <w:br/>
-        <w:t xml:space="preserve">     Adv. Healthcare Mater. 10, 2001110 (2021).  [Ag/SiNW substrate: 120 nm Ag, PECVD]</w:t>
-        <w:br/>
-        <w:t xml:space="preserve">     DOI: 10.1002/adhm.202001110</w:t>
-      </w:r>
-      <w:proofErr w:type="gramStart"/>
-      <w:r>
-        <w:rPr>
-          <w:color w:val="222222"/>
-          <w:sz w:val="15"/>
-          <w:lang w:val="it-IT"/>
-        </w:rPr>
-      </w:r>
-      <w:proofErr w:type="gramEnd"/>
-      <w:r>
-        <w:rPr>
-          <w:color w:val="222222"/>
-          <w:sz w:val="15"/>
-          <w:lang w:val="it-IT"/>
-        </w:rPr>
-      </w:r>
-      <w:proofErr w:type="spellStart"/>
-      <w:r>
-        <w:rPr>
-          <w:color w:val="222222"/>
-          <w:sz w:val="15"/>
-          <w:lang w:val="it-IT"/>
-        </w:rPr>
-      </w:r>
-      <w:proofErr w:type="spellEnd"/>
-      <w:r>
-        <w:rPr>
-          <w:color w:val="222222"/>
-          <w:sz w:val="15"/>
-          <w:lang w:val="it-IT"/>
-        </w:rPr>
-      </w:r>
-      <w:r>
-        <w:rPr>
-          <w:color w:val="222222"/>
-          <w:sz w:val="15"/>
-        </w:rPr>
+          <w:b/>
+          <w:color w:val="1A375C"/>
+          <w:sz w:val="17"/>
+        </w:rPr>
+        <w:t xml:space="preserve">[2]  </w:t>
+      </w:r>
+      <w:r>
+        <w:rPr>
+          <w:color w:val="111111"/>
+          <w:sz w:val="17"/>
+        </w:rPr>
+        <w:t xml:space="preserve">Paria D., Bhatt M., Singh P., Bhatt D.L., Bhardwaj N., Bhatt J.S.  </w:t>
+      </w:r>
+      <w:r>
+        <w:rPr>
+          <w:i/>
+          <w:color w:val="111111"/>
+          <w:sz w:val="17"/>
+        </w:rPr>
+        <w:t xml:space="preserve">Silver-Coated Disordered Silicon Nanowires Provide Highly Sensitive Label-Free Glycated Albumin Detection through Molecular Trapping and Plasmonic Hotspot Formation.  </w:t>
+      </w:r>
+      <w:r>
+        <w:rPr>
+          <w:color w:val="111111"/>
+          <w:sz w:val="17"/>
+        </w:rPr>
+        <w:t xml:space="preserve">Adv. Healthcare Mater. 10, 2001110 (2021).  [Ag/SiNW substrate: 120 nm Ag, PECVD, EF ~10⁴]  </w:t>
+      </w:r>
+      <w:r>
+        <w:rPr>
+          <w:b/>
+          <w:color w:val="1A375C"/>
+          <w:sz w:val="17"/>
+        </w:rPr>
+        <w:t xml:space="preserve">DOI: </w:t>
+      </w:r>
+      <w:r>
+        <w:rPr>
+          <w:color w:val="1A1A8B"/>
+          <w:sz w:val="17"/>
+        </w:rPr>
+        <w:t>10.1002/adhm.202001110</w:t>
       </w:r>
     </w:p>
     <w:p>
       <w:pPr>
-        <w:spacing w:after="20"/>
-        <w:ind w:left="280" w:hanging="280"/>
+        <w:spacing w:before="80" w:after="80"/>
+        <w:ind w:left="440" w:hanging="440"/>
+        <w:jc w:val="left"/>
       </w:pPr>
       <w:r>
         <w:rPr>
-          <w:b w:val="0"/>
-          <w:i w:val="0"/>
-          <w:color w:val="222222"/>
-          <w:sz w:val="15"/>
-        </w:rPr>
-        <w:t>[3]  Watanabe H., Ishida Y., Hayazawa N., Inouye Y., Kawata S.</w:t>
-        <w:br/>
-        <w:t xml:space="preserve">     "Surface-Enhanced Raman Spectroscopic and Density Functional Theory Study</w:t>
-        <w:br/>
-        <w:t xml:space="preserve">      of Adenine Adsorption to Silver Surfaces"</w:t>
-        <w:br/>
-        <w:t xml:space="preserve">     J. Phys. Chem. B 105, 4441–4453 (2001).</w:t>
-        <w:br/>
-        <w:t xml:space="preserve">     DOI: 10.1021/jp010789f</w:t>
+          <w:b/>
+          <w:color w:val="1A375C"/>
+          <w:sz w:val="17"/>
+        </w:rPr>
+        <w:t xml:space="preserve">[3]  </w:t>
+      </w:r>
+      <w:r>
+        <w:rPr>
+          <w:color w:val="111111"/>
+          <w:sz w:val="17"/>
+        </w:rPr>
+        <w:t xml:space="preserve">Watanabe H., Ishida Y., Hayazawa N., Inouye Y., Kawata S.  </w:t>
+      </w:r>
+      <w:r>
+        <w:rPr>
+          <w:i/>
+          <w:color w:val="111111"/>
+          <w:sz w:val="17"/>
+        </w:rPr>
+        <w:t xml:space="preserve">Surface-Enhanced Raman Spectroscopic and Density Functional Theory Study of Adenine Adsorption to Silver Surfaces.  </w:t>
+      </w:r>
+      <w:r>
+        <w:rPr>
+          <w:color w:val="111111"/>
+          <w:sz w:val="17"/>
+        </w:rPr>
+        <w:t xml:space="preserve">J. Phys. Chem. B 105, 4441–4453 (2001).  [DFT + adenine–Ag N7 binding; +12 cm⁻¹ blue shift]  </w:t>
+      </w:r>
+      <w:r>
+        <w:rPr>
+          <w:b/>
+          <w:color w:val="1A375C"/>
+          <w:sz w:val="17"/>
+        </w:rPr>
+        <w:t xml:space="preserve">DOI: </w:t>
+      </w:r>
+      <w:r>
+        <w:rPr>
+          <w:color w:val="1A1A8B"/>
+          <w:sz w:val="17"/>
+        </w:rPr>
+        <w:t>10.1021/jp010789f</w:t>
       </w:r>
     </w:p>
     <w:p>
       <w:pPr>
-        <w:spacing w:after="20"/>
-        <w:ind w:left="280" w:hanging="280"/>
+        <w:spacing w:before="80" w:after="80"/>
+        <w:ind w:left="440" w:hanging="440"/>
+        <w:jc w:val="left"/>
       </w:pPr>
       <w:r>
         <w:rPr>
-          <w:b w:val="0"/>
-          <w:i w:val="0"/>
-          <w:color w:val="222222"/>
-          <w:sz w:val="15"/>
-        </w:rPr>
-        <w:t>[4]  Barhoumi A., Halas N.J.</w:t>
-        <w:br/>
-        <w:t xml:space="preserve">     "Surface-Enhanced Raman Spectroscopy of DNA"</w:t>
-        <w:br/>
-        <w:t xml:space="preserve">     J. Am. Chem. Soc. 130, 5523–5529 (2008).</w:t>
-        <w:br/>
-        <w:t xml:space="preserve">     DOI: 10.1021/ja800023j</w:t>
+          <w:b/>
+          <w:color w:val="1A375C"/>
+          <w:sz w:val="17"/>
+        </w:rPr>
+        <w:t xml:space="preserve">[4]  </w:t>
+      </w:r>
+      <w:r>
+        <w:rPr>
+          <w:color w:val="111111"/>
+          <w:sz w:val="17"/>
+        </w:rPr>
+        <w:t xml:space="preserve">Barhoumi A., Halas N.J.  </w:t>
+      </w:r>
+      <w:r>
+        <w:rPr>
+          <w:i/>
+          <w:color w:val="111111"/>
+          <w:sz w:val="17"/>
+        </w:rPr>
+        <w:t xml:space="preserve">Surface-Enhanced Raman Spectroscopy of DNA.  </w:t>
+      </w:r>
+      <w:r>
+        <w:rPr>
+          <w:color w:val="111111"/>
+          <w:sz w:val="17"/>
+        </w:rPr>
+        <w:t xml:space="preserve">J. Am. Chem. Soc. 130, 5523–5529 (2008).  [Adenine ring breathing at 736 cm⁻¹ on Ag; in-plane modes electromagnetic only]  </w:t>
+      </w:r>
+      <w:r>
+        <w:rPr>
+          <w:b/>
+          <w:color w:val="1A375C"/>
+          <w:sz w:val="17"/>
+        </w:rPr>
+        <w:t xml:space="preserve">DOI: </w:t>
+      </w:r>
+      <w:r>
+        <w:rPr>
+          <w:color w:val="1A1A8B"/>
+          <w:sz w:val="17"/>
+        </w:rPr>
+        <w:t>10.1021/ja800023j</w:t>
       </w:r>
     </w:p>
     <w:p>
       <w:pPr>
-        <w:spacing w:after="20"/>
-        <w:ind w:left="280" w:hanging="280"/>
+        <w:spacing w:before="80" w:after="80"/>
+        <w:ind w:left="440" w:hanging="440"/>
+        <w:jc w:val="left"/>
       </w:pPr>
       <w:r>
         <w:rPr>
-          <w:b w:val="0"/>
-          <w:i w:val="0"/>
-          <w:color w:val="222222"/>
-          <w:sz w:val="15"/>
-          <w:lang w:val="it-IT"/>
-        </w:rPr>
-        <w:t>[5]  Huang Z., Meng G., Huang Q., Yang Y., Zhu C., Tang C.</w:t>
-        <w:br/>
-        <w:t xml:space="preserve">     "Ordered Ag/Si Nanowires Array: Wide-Range Surface-Enhanced Raman Spectroscopy</w:t>
-        <w:br/>
-        <w:t xml:space="preserve">      for Reproducible Biomolecule Detection"</w:t>
-        <w:br/>
-        <w:t xml:space="preserve">     Nano Lett. 13, 5039–5044 (2013).</w:t>
-        <w:br/>
-        <w:t xml:space="preserve">     DOI: 10.1021/nl401920u</w:t>
-      </w:r>
-      <w:proofErr w:type="gramStart"/>
-      <w:r>
-        <w:rPr>
-          <w:color w:val="222222"/>
-          <w:sz w:val="15"/>
-          <w:lang w:val="it-IT"/>
-        </w:rPr>
-      </w:r>
-      <w:proofErr w:type="gramEnd"/>
-      <w:r>
-        <w:rPr>
-          <w:color w:val="222222"/>
-          <w:sz w:val="15"/>
-          <w:lang w:val="it-IT"/>
-        </w:rPr>
-      </w:r>
-      <w:r>
-        <w:rPr>
-          <w:color w:val="222222"/>
-          <w:sz w:val="15"/>
-        </w:rPr>
-      </w:r>
-      <w:proofErr w:type="spellStart"/>
-      <w:r>
-        <w:rPr>
-          <w:color w:val="222222"/>
-          <w:sz w:val="15"/>
-        </w:rPr>
-      </w:r>
-      <w:proofErr w:type="spellEnd"/>
-      <w:r>
-        <w:rPr>
-          <w:color w:val="222222"/>
-          <w:sz w:val="15"/>
-        </w:rPr>
+          <w:b/>
+          <w:color w:val="1A375C"/>
+          <w:sz w:val="17"/>
+        </w:rPr>
+        <w:t xml:space="preserve">[5]  </w:t>
+      </w:r>
+      <w:r>
+        <w:rPr>
+          <w:color w:val="111111"/>
+          <w:sz w:val="17"/>
+        </w:rPr>
+        <w:t xml:space="preserve">Huang Z., Meng G., Huang Q., Yang Y., Zhu C., Tang C.  </w:t>
+      </w:r>
+      <w:r>
+        <w:rPr>
+          <w:i/>
+          <w:color w:val="111111"/>
+          <w:sz w:val="17"/>
+        </w:rPr>
+        <w:t xml:space="preserve">Ordered Ag/Si Nanowires Array: Wide-Range Surface-Enhanced Raman Spectroscopy for Reproducible Biomolecule Detection.  </w:t>
+      </w:r>
+      <w:r>
+        <w:rPr>
+          <w:color w:val="111111"/>
+          <w:sz w:val="17"/>
+        </w:rPr>
+        <w:t xml:space="preserve">Nano Lett. 13, 5039–5044 (2013).  [Ordered Ag/SiNW; adenine dominant SERS band at 736 cm⁻¹]  </w:t>
+      </w:r>
+      <w:r>
+        <w:rPr>
+          <w:b/>
+          <w:color w:val="1A375C"/>
+          <w:sz w:val="17"/>
+        </w:rPr>
+        <w:t xml:space="preserve">DOI: </w:t>
+      </w:r>
+      <w:r>
+        <w:rPr>
+          <w:color w:val="1A1A8B"/>
+          <w:sz w:val="17"/>
+        </w:rPr>
+        <w:t>10.1021/nl401920u</w:t>
       </w:r>
     </w:p>
     <w:p>
       <w:pPr>
-        <w:spacing w:after="20"/>
-        <w:ind w:left="280" w:hanging="280"/>
+        <w:spacing w:before="80" w:after="80"/>
+        <w:ind w:left="440" w:hanging="440"/>
+        <w:jc w:val="left"/>
       </w:pPr>
       <w:r>
         <w:rPr>
-          <w:b w:val="0"/>
-          <w:i w:val="0"/>
-          <w:color w:val="222222"/>
-          <w:sz w:val="15"/>
-        </w:rPr>
-        <w:t>[6]  Frosch T., Deckert V.</w:t>
-        <w:br/>
-        <w:t xml:space="preserve">     "Neurological disorders studied at the single cell level by Raman and</w:t>
-        <w:br/>
-        <w:t xml:space="preserve">      surface-enhanced Raman scattering spectroscopy"</w:t>
-        <w:br/>
-        <w:t xml:space="preserve">     Beilstein J. Nanotechnol. 2, 628–636 (2011).</w:t>
-        <w:br/>
-        <w:t xml:space="preserve">     DOI: 10.3762/bjnano.2.66</w:t>
+          <w:b/>
+          <w:color w:val="1A375C"/>
+          <w:sz w:val="17"/>
+        </w:rPr>
+        <w:t xml:space="preserve">[6]  </w:t>
+      </w:r>
+      <w:r>
+        <w:rPr>
+          <w:color w:val="111111"/>
+          <w:sz w:val="17"/>
+        </w:rPr>
+        <w:t xml:space="preserve">Frosch T., Deckert V.  </w:t>
+      </w:r>
+      <w:r>
+        <w:rPr>
+          <w:i/>
+          <w:color w:val="111111"/>
+          <w:sz w:val="17"/>
+        </w:rPr>
+        <w:t xml:space="preserve">Neurological disorders studied at the single cell level by Raman and surface-enhanced Raman scattering spectroscopy.  </w:t>
+      </w:r>
+      <w:r>
+        <w:rPr>
+          <w:color w:val="111111"/>
+          <w:sz w:val="17"/>
+        </w:rPr>
+        <w:t xml:space="preserve">Beilstein J. Nanotechnol. 2, 628–636 (2011).  [TERS on poly(dA): adenine ring breathing +10 cm⁻¹ on Ag tip]  </w:t>
+      </w:r>
+      <w:r>
+        <w:rPr>
+          <w:b/>
+          <w:color w:val="1A375C"/>
+          <w:sz w:val="17"/>
+        </w:rPr>
+        <w:t xml:space="preserve">DOI: </w:t>
+      </w:r>
+      <w:r>
+        <w:rPr>
+          <w:color w:val="1A1A8B"/>
+          <w:sz w:val="17"/>
+        </w:rPr>
+        <w:t>10.3762/bjnano.2.66</w:t>
       </w:r>
     </w:p>
     <w:p>
       <w:pPr>
-        <w:spacing w:after="20"/>
-        <w:ind w:left="280" w:hanging="280"/>
+        <w:spacing w:before="80" w:after="80"/>
+        <w:ind w:left="440" w:hanging="440"/>
+        <w:jc w:val="left"/>
       </w:pPr>
       <w:r>
         <w:rPr>
-          <w:b w:val="0"/>
-          <w:i w:val="0"/>
-          <w:color w:val="222222"/>
-          <w:sz w:val="15"/>
-        </w:rPr>
-        <w:t>[7]  Kubryk P., Niessner R., Ivleva N.P.</w:t>
-        <w:br/>
-        <w:t xml:space="preserve">     "The origin of the band at around 730 cm⁻¹ in the SERS spectra of bacteria:</w:t>
-        <w:br/>
-        <w:t xml:space="preserve">      a stable isotope approach"</w:t>
-        <w:br/>
-        <w:t xml:space="preserve">     Analyst 141, 2874–2878 (2016).  [¹⁵N isotope proof: 730 cm⁻¹ band = adenine]</w:t>
-        <w:br/>
-        <w:t xml:space="preserve">     DOI: 10.1039/C6AN00306K</w:t>
+          <w:b/>
+          <w:color w:val="1A375C"/>
+          <w:sz w:val="17"/>
+        </w:rPr>
+        <w:t xml:space="preserve">[7]  </w:t>
+      </w:r>
+      <w:r>
+        <w:rPr>
+          <w:color w:val="111111"/>
+          <w:sz w:val="17"/>
+        </w:rPr>
+        <w:t xml:space="preserve">Kubryk P., Niessner R., Ivleva N.P.  </w:t>
+      </w:r>
+      <w:r>
+        <w:rPr>
+          <w:i/>
+          <w:color w:val="111111"/>
+          <w:sz w:val="17"/>
+        </w:rPr>
+        <w:t xml:space="preserve">The origin of the band at around 730 cm⁻¹ in the SERS spectra of bacteria: a stable isotope approach.  </w:t>
+      </w:r>
+      <w:r>
+        <w:rPr>
+          <w:color w:val="111111"/>
+          <w:sz w:val="17"/>
+        </w:rPr>
+        <w:t xml:space="preserve">Analyst 141, 2874–2878 (2016).  [¹⁵N isotope proof: SERS band ~730 cm⁻¹ is adenine]  </w:t>
+      </w:r>
+      <w:r>
+        <w:rPr>
+          <w:b/>
+          <w:color w:val="1A375C"/>
+          <w:sz w:val="17"/>
+        </w:rPr>
+        <w:t xml:space="preserve">DOI: </w:t>
+      </w:r>
+      <w:r>
+        <w:rPr>
+          <w:color w:val="1A1A8B"/>
+          <w:sz w:val="17"/>
+        </w:rPr>
+        <w:t>10.1039/C6AN00306K</w:t>
       </w:r>
     </w:p>
     <w:p>
       <w:pPr>
-        <w:spacing w:after="20"/>
-        <w:ind w:left="280" w:hanging="280"/>
+        <w:spacing w:before="80" w:after="80"/>
+        <w:ind w:left="440" w:hanging="440"/>
+        <w:jc w:val="left"/>
       </w:pPr>
       <w:r>
         <w:rPr>
-          <w:b w:val="0"/>
-          <w:i w:val="0"/>
-          <w:color w:val="222222"/>
-          <w:sz w:val="15"/>
-        </w:rPr>
-        <w:t>[8]  Papadopoulou E., Bell S.E.J.</w:t>
-        <w:br/>
-        <w:t xml:space="preserve">     "Label-Free Detection of Single-Base Mismatches in DNA by</w:t>
-        <w:br/>
-        <w:t xml:space="preserve">      Surface-Enhanced Raman Spectroscopy"</w:t>
-        <w:br/>
-        <w:t xml:space="preserve">     Angew. Chem. Int. Ed. 50, 9058–9061 (2011).</w:t>
-        <w:br/>
-        <w:t xml:space="preserve">     DOI: 10.1002/anie.201102776</w:t>
+          <w:b/>
+          <w:color w:val="1A375C"/>
+          <w:sz w:val="17"/>
+        </w:rPr>
+        <w:t xml:space="preserve">[8]  </w:t>
+      </w:r>
+      <w:r>
+        <w:rPr>
+          <w:color w:val="111111"/>
+          <w:sz w:val="17"/>
+        </w:rPr>
+        <w:t xml:space="preserve">Papadopoulou E., Bell S.E.J.  </w:t>
+      </w:r>
+      <w:r>
+        <w:rPr>
+          <w:i/>
+          <w:color w:val="111111"/>
+          <w:sz w:val="17"/>
+        </w:rPr>
+        <w:t xml:space="preserve">Label-Free Detection of Single-Base Mismatches in DNA by Surface-Enhanced Raman Spectroscopy.  </w:t>
+      </w:r>
+      <w:r>
+        <w:rPr>
+          <w:color w:val="111111"/>
+          <w:sz w:val="17"/>
+        </w:rPr>
+        <w:t xml:space="preserve">Angew. Chem. Int. Ed. 50, 9058–9061 (2011).  </w:t>
+      </w:r>
+      <w:r>
+        <w:rPr>
+          <w:b/>
+          <w:color w:val="1A375C"/>
+          <w:sz w:val="17"/>
+        </w:rPr>
+        <w:t xml:space="preserve">DOI: </w:t>
+      </w:r>
+      <w:r>
+        <w:rPr>
+          <w:color w:val="1A1A8B"/>
+          <w:sz w:val="17"/>
+        </w:rPr>
+        <w:t>10.1002/anie.201102776</w:t>
       </w:r>
     </w:p>
     <w:p>
       <w:pPr>
-        <w:spacing w:after="20"/>
-        <w:ind w:left="280" w:hanging="280"/>
+        <w:spacing w:before="80" w:after="80"/>
+        <w:ind w:left="440" w:hanging="440"/>
+        <w:jc w:val="left"/>
       </w:pPr>
       <w:r>
         <w:rPr>
-          <w:b w:val="0"/>
-          <w:i w:val="0"/>
-          <w:color w:val="222222"/>
-          <w:sz w:val="15"/>
-          <w:lang w:val="it-IT"/>
-        </w:rPr>
-        <w:t>[9]  Madzharova F., Heiner Z., Gühlke M., Kneipp J.</w:t>
-        <w:br/>
-        <w:t xml:space="preserve">     "Surface-Enhanced Hyper-Raman Spectra of Adenine, Guanine, Cytosine,</w:t>
-        <w:br/>
-        <w:t xml:space="preserve">      Thymine, and Uracil"</w:t>
-        <w:br/>
-        <w:t xml:space="preserve">     J. Phys. Chem. C 120, 15415–15423 (2016).  [SEHRS; nucleobase modes on Ag NPs]</w:t>
-        <w:br/>
-        <w:t xml:space="preserve">     DOI: 10.1021/acs.jpcc.6b02753</w:t>
-      </w:r>
-      <w:proofErr w:type="gramStart"/>
-      <w:r>
-        <w:rPr>
-          <w:color w:val="222222"/>
-          <w:sz w:val="15"/>
-          <w:lang w:val="it-IT"/>
-        </w:rPr>
-      </w:r>
-      <w:proofErr w:type="spellStart"/>
-      <w:r>
-        <w:rPr>
-          <w:color w:val="222222"/>
-          <w:sz w:val="15"/>
-          <w:lang w:val="it-IT"/>
-        </w:rPr>
-      </w:r>
-      <w:proofErr w:type="spellEnd"/>
-      <w:proofErr w:type="gramEnd"/>
-      <w:r>
-        <w:rPr>
-          <w:color w:val="222222"/>
-          <w:sz w:val="15"/>
-          <w:lang w:val="it-IT"/>
-        </w:rPr>
-      </w:r>
-      <w:proofErr w:type="spellStart"/>
-      <w:r>
-        <w:rPr>
-          <w:color w:val="222222"/>
-          <w:sz w:val="15"/>
-          <w:lang w:val="it-IT"/>
-        </w:rPr>
-      </w:r>
-      <w:proofErr w:type="spellEnd"/>
-      <w:r>
-        <w:rPr>
-          <w:color w:val="222222"/>
-          <w:sz w:val="15"/>
-          <w:lang w:val="it-IT"/>
-        </w:rPr>
-      </w:r>
-      <w:r>
-        <w:rPr>
-          <w:color w:val="222222"/>
-          <w:sz w:val="15"/>
-        </w:rPr>
+          <w:b/>
+          <w:color w:val="1A375C"/>
+          <w:sz w:val="17"/>
+        </w:rPr>
+        <w:t xml:space="preserve">[9]  </w:t>
+      </w:r>
+      <w:r>
+        <w:rPr>
+          <w:color w:val="111111"/>
+          <w:sz w:val="17"/>
+        </w:rPr>
+        <w:t xml:space="preserve">Madzharova F., Heiner Z., Gühlke M., Kneipp J.  </w:t>
+      </w:r>
+      <w:r>
+        <w:rPr>
+          <w:i/>
+          <w:color w:val="111111"/>
+          <w:sz w:val="17"/>
+        </w:rPr>
+        <w:t xml:space="preserve">Surface-Enhanced Hyper-Raman Spectra of Adenine, Guanine, Cytosine, Thymine, and Uracil.  </w:t>
+      </w:r>
+      <w:r>
+        <w:rPr>
+          <w:color w:val="111111"/>
+          <w:sz w:val="17"/>
+        </w:rPr>
+        <w:t xml:space="preserve">J. Phys. Chem. C 120, 15415–15423 (2016).  [SEHRS; nucleobase vibrational modes on Ag NPs]  </w:t>
+      </w:r>
+      <w:r>
+        <w:rPr>
+          <w:b/>
+          <w:color w:val="1A375C"/>
+          <w:sz w:val="17"/>
+        </w:rPr>
+        <w:t xml:space="preserve">DOI: </w:t>
+      </w:r>
+      <w:r>
+        <w:rPr>
+          <w:color w:val="1A1A8B"/>
+          <w:sz w:val="17"/>
+        </w:rPr>
+        <w:t>10.1021/acs.jpcc.6b02753</w:t>
       </w:r>
     </w:p>
     <w:p>
       <w:pPr>
-        <w:spacing w:after="20"/>
-        <w:ind w:left="280" w:hanging="280"/>
+        <w:spacing w:before="80" w:after="80"/>
+        <w:ind w:left="440" w:hanging="440"/>
+        <w:jc w:val="left"/>
       </w:pPr>
       <w:r>
         <w:rPr>
-          <w:b w:val="0"/>
-          <w:i w:val="0"/>
-          <w:color w:val="222222"/>
-          <w:sz w:val="15"/>
-          <w:lang w:val="it-IT"/>
-        </w:rPr>
-        <w:t>[10] Garcia-Rico E., Alvarez-Puebla R.A., Guerrini L.</w:t>
-        <w:br/>
-        <w:t xml:space="preserve">     "Direct surface-enhanced Raman scattering (SERS) spectroscopy of nucleic acids:</w:t>
-        <w:br/>
-        <w:t xml:space="preserve">      from fundamental studies to real-life applications"</w:t>
-        <w:br/>
-        <w:t xml:space="preserve">     Chem. Soc. Rev. 47, 4909–4923 (2018).</w:t>
-        <w:br/>
-        <w:t xml:space="preserve">     DOI: 10.1039/C7CS00809K</w:t>
-      </w:r>
-      <w:proofErr w:type="spellStart"/>
-      <w:r>
-        <w:rPr>
-          <w:color w:val="222222"/>
-          <w:sz w:val="15"/>
-          <w:lang w:val="it-IT"/>
-        </w:rPr>
-      </w:r>
-      <w:proofErr w:type="spellEnd"/>
-      <w:r>
-        <w:rPr>
-          <w:color w:val="222222"/>
-          <w:sz w:val="15"/>
-          <w:lang w:val="it-IT"/>
-        </w:rPr>
-      </w:r>
-      <w:proofErr w:type="spellStart"/>
-      <w:r>
-        <w:rPr>
-          <w:color w:val="222222"/>
-          <w:sz w:val="15"/>
-          <w:lang w:val="it-IT"/>
-        </w:rPr>
-      </w:r>
-      <w:proofErr w:type="spellEnd"/>
-      <w:r>
-        <w:rPr>
-          <w:color w:val="222222"/>
-          <w:sz w:val="15"/>
-          <w:lang w:val="it-IT"/>
-        </w:rPr>
-      </w:r>
-      <w:r>
-        <w:rPr>
-          <w:color w:val="222222"/>
-          <w:sz w:val="15"/>
-        </w:rPr>
+          <w:b/>
+          <w:color w:val="1A375C"/>
+          <w:sz w:val="17"/>
+        </w:rPr>
+        <w:t xml:space="preserve">[10]  </w:t>
+      </w:r>
+      <w:r>
+        <w:rPr>
+          <w:color w:val="111111"/>
+          <w:sz w:val="17"/>
+        </w:rPr>
+        <w:t xml:space="preserve">Garcia-Rico E., Alvarez-Puebla R.A., Guerrini L.  </w:t>
+      </w:r>
+      <w:r>
+        <w:rPr>
+          <w:i/>
+          <w:color w:val="111111"/>
+          <w:sz w:val="17"/>
+        </w:rPr>
+        <w:t xml:space="preserve">Direct surface-enhanced Raman scattering (SERS) spectroscopy of nucleic acids: from fundamental studies to real-life applications.  </w:t>
+      </w:r>
+      <w:r>
+        <w:rPr>
+          <w:color w:val="111111"/>
+          <w:sz w:val="17"/>
+        </w:rPr>
+        <w:t xml:space="preserve">Chem. Soc. Rev. 47, 4909–4923 (2018).  [DNA SERS review: orientation, backbone vs base sensitivity, substrate geometry]  </w:t>
+      </w:r>
+      <w:r>
+        <w:rPr>
+          <w:b/>
+          <w:color w:val="1A375C"/>
+          <w:sz w:val="17"/>
+        </w:rPr>
+        <w:t xml:space="preserve">DOI: </w:t>
+      </w:r>
+      <w:r>
+        <w:rPr>
+          <w:color w:val="1A1A8B"/>
+          <w:sz w:val="17"/>
+        </w:rPr>
+        <w:t>10.1039/C7CS00809K</w:t>
       </w:r>
     </w:p>
     <w:p>
       <w:pPr>
-        <w:spacing w:after="20"/>
-        <w:ind w:left="280" w:hanging="280"/>
+        <w:spacing w:before="80" w:after="80"/>
+        <w:ind w:left="440" w:hanging="440"/>
+        <w:jc w:val="left"/>
       </w:pPr>
       <w:r>
         <w:rPr>
-          <w:b w:val="0"/>
-          <w:i w:val="0"/>
-          <w:color w:val="222222"/>
-          <w:sz w:val="15"/>
-        </w:rPr>
-        <w:t>[11] Safar W., Azziz A., Edely M., Lamy de la Chapelle M.</w:t>
-        <w:br/>
-        <w:t xml:space="preserve">     "Conventional Raman, SERS and TERS Studies of DNA Compounds"</w:t>
-        <w:br/>
-        <w:t xml:space="preserve">     Chemosensors 11, 399 (2023).</w:t>
-        <w:br/>
-        <w:t xml:space="preserve">     DOI: 10.3390/chemosensors11070399</w:t>
+          <w:b/>
+          <w:color w:val="1A375C"/>
+          <w:sz w:val="17"/>
+        </w:rPr>
+        <w:t xml:space="preserve">[11]  </w:t>
+      </w:r>
+      <w:r>
+        <w:rPr>
+          <w:color w:val="111111"/>
+          <w:sz w:val="17"/>
+        </w:rPr>
+        <w:t xml:space="preserve">Safar W., Azziz A., Edely M., Lamy de la Chapelle M.  </w:t>
+      </w:r>
+      <w:r>
+        <w:rPr>
+          <w:i/>
+          <w:color w:val="111111"/>
+          <w:sz w:val="17"/>
+        </w:rPr>
+        <w:t xml:space="preserve">Conventional Raman, SERS and TERS Studies of DNA Compounds.  </w:t>
+      </w:r>
+      <w:r>
+        <w:rPr>
+          <w:color w:val="111111"/>
+          <w:sz w:val="17"/>
+        </w:rPr>
+        <w:t xml:space="preserve">Chemosensors 11, 399 (2023).  [Review of all DNA bases by normal Raman, SERS, TERS; deoxyribose modes at 912 cm⁻¹]  </w:t>
+      </w:r>
+      <w:r>
+        <w:rPr>
+          <w:b/>
+          <w:color w:val="1A375C"/>
+          <w:sz w:val="17"/>
+        </w:rPr>
+        <w:t xml:space="preserve">DOI: </w:t>
+      </w:r>
+      <w:r>
+        <w:rPr>
+          <w:color w:val="1A1A8B"/>
+          <w:sz w:val="17"/>
+        </w:rPr>
+        <w:t>10.3390/chemosensors11070399</w:t>
       </w:r>
     </w:p>
     <w:p>
       <w:pPr>
-        <w:spacing w:after="20"/>
-        <w:ind w:left="280" w:hanging="280"/>
+        <w:spacing w:before="80" w:after="80"/>
+        <w:ind w:left="440" w:hanging="440"/>
+        <w:jc w:val="left"/>
       </w:pPr>
       <w:r>
         <w:rPr>
-          <w:b w:val="0"/>
-          <w:i w:val="0"/>
-          <w:color w:val="222222"/>
-          <w:sz w:val="15"/>
-        </w:rPr>
-        <w:t>[12] Bozzini B., De Gaudenzi G.P., Mele C.</w:t>
-        <w:br/>
-        <w:t xml:space="preserve">     "A SERS investigation of the electrodeposition of Ag–Au alloys</w:t>
-        <w:br/>
-        <w:t xml:space="preserve">      from free-cyanide solutions"</w:t>
-        <w:br/>
-        <w:t xml:space="preserve">     J. Electroanal. Chem. 563, 133–143 (2004).  [C≡N stretch ~2080–2100 cm⁻¹ on Ag]</w:t>
-        <w:br/>
-        <w:t xml:space="preserve">     DOI: 10.1016/j.jelechem.2003.09.025</w:t>
+          <w:b/>
+          <w:color w:val="1A375C"/>
+          <w:sz w:val="17"/>
+        </w:rPr>
+        <w:t xml:space="preserve">[12]  </w:t>
+      </w:r>
+      <w:r>
+        <w:rPr>
+          <w:color w:val="111111"/>
+          <w:sz w:val="17"/>
+        </w:rPr>
+        <w:t xml:space="preserve">Bozzini B., De Gaudenzi G.P., Mele C.  </w:t>
+      </w:r>
+      <w:r>
+        <w:rPr>
+          <w:i/>
+          <w:color w:val="111111"/>
+          <w:sz w:val="17"/>
+        </w:rPr>
+        <w:t xml:space="preserve">A SERS investigation of the electrodeposition of Ag–Au alloys from free-cyanide solutions.  </w:t>
+      </w:r>
+      <w:r>
+        <w:rPr>
+          <w:color w:val="111111"/>
+          <w:sz w:val="17"/>
+        </w:rPr>
+        <w:t xml:space="preserve">J. Electroanal. Chem. 563, 133–143 (2004).  [C≡N stretch ~2080–2100 cm⁻¹ assigned to Ag–CN surface complex]  </w:t>
+      </w:r>
+      <w:r>
+        <w:rPr>
+          <w:b/>
+          <w:color w:val="1A375C"/>
+          <w:sz w:val="17"/>
+        </w:rPr>
+        <w:t xml:space="preserve">DOI: </w:t>
+      </w:r>
+      <w:r>
+        <w:rPr>
+          <w:color w:val="1A1A8B"/>
+          <w:sz w:val="17"/>
+        </w:rPr>
+        <w:t>10.1016/j.jelechem.2003.09.025</w:t>
       </w:r>
     </w:p>
     <w:p>
       <w:pPr>
-        <w:spacing w:after="20"/>
-        <w:ind w:left="280" w:hanging="280"/>
+        <w:spacing w:before="80" w:after="80"/>
+        <w:ind w:left="440" w:hanging="440"/>
+        <w:jc w:val="left"/>
       </w:pPr>
       <w:r>
         <w:rPr>
-          <w:b w:val="0"/>
-          <w:i w:val="0"/>
-          <w:color w:val="222222"/>
-          <w:sz w:val="15"/>
-        </w:rPr>
-        <w:t>[13] Barhoumi A., Halas N.J.</w:t>
-        <w:br/>
-        <w:t xml:space="preserve">     "Label-Free Detection of DNA Hybridization Using Surface Enhanced</w:t>
-        <w:br/>
-        <w:t xml:space="preserve">      Raman Spectroscopy"</w:t>
-        <w:br/>
-        <w:t xml:space="preserve">     J. Am. Chem. Soc. 132, 12792–12793 (2010).</w:t>
-        <w:br/>
-        <w:t xml:space="preserve">     DOI: 10.1021/ja105678z</w:t>
-      </w:r>
-    </w:p>
-    <w:p>
-      <w:pPr>
-        <w:spacing w:after="20"/>
-        <w:ind w:left="280" w:hanging="280"/>
-      </w:pPr>
-      <w:r>
-        <w:rPr>
-          <w:color w:val="222222"/>
-          <w:sz w:val="15"/>
-        </w:rPr>
+          <w:b/>
+          <w:color w:val="1A375C"/>
+          <w:sz w:val="17"/>
+        </w:rPr>
+        <w:t xml:space="preserve">[13]  </w:t>
+      </w:r>
+      <w:r>
+        <w:rPr>
+          <w:color w:val="111111"/>
+          <w:sz w:val="17"/>
+        </w:rPr>
+        <w:t xml:space="preserve">Barhoumi A., Halas N.J.  </w:t>
+      </w:r>
+      <w:r>
+        <w:rPr>
+          <w:i/>
+          <w:color w:val="111111"/>
+          <w:sz w:val="17"/>
+        </w:rPr>
+        <w:t xml:space="preserve">Label-Free Detection of DNA Hybridization Using Surface Enhanced Raman Spectroscopy.  </w:t>
+      </w:r>
+      <w:r>
+        <w:rPr>
+          <w:color w:val="111111"/>
+          <w:sz w:val="17"/>
+        </w:rPr>
+        <w:t xml:space="preserve">J. Am. Chem. Soc. 132, 12792–12793 (2010).  </w:t>
+      </w:r>
+      <w:r>
+        <w:rPr>
+          <w:b/>
+          <w:color w:val="1A375C"/>
+          <w:sz w:val="17"/>
+        </w:rPr>
+        <w:t xml:space="preserve">DOI: </w:t>
+      </w:r>
+      <w:r>
+        <w:rPr>
+          <w:color w:val="1A1A8B"/>
+          <w:sz w:val="17"/>
+        </w:rPr>
+        <w:t>10.1021/ja105678z</w:t>
       </w:r>
     </w:p>
     <w:sectPr>

</xml_diff>